<commit_message>
chore(templates): update contract templates and forms
Routine refresh of contract template and external-form artifacts and catalog metadata. Contributions are welcome — open an issue or pull request and we'll fold it in.
</commit_message>
<xml_diff>
--- a/templates/common-paper-cc-by-4.0/common-paper-ai-addendum/template.docx
+++ b/templates/common-paper-cc-by-4.0/common-paper-ai-addendum/template.docx
@@ -2295,6 +2295,10 @@
               </w:rPr>
             </w:r>
             <w:r>
+              <w:rPr>
+                <w:sz w:val="18"/>
+                <w:szCs w:val="18"/>
+              </w:rPr>
               <w:t>{provider_signatory_name}</w:t>
             </w:r>
           </w:p>
@@ -2354,6 +2358,10 @@
               </w:rPr>
             </w:r>
             <w:r>
+              <w:rPr>
+                <w:sz w:val="18"/>
+                <w:szCs w:val="18"/>
+              </w:rPr>
               <w:t>{customer_signatory_name}</w:t>
             </w:r>
           </w:p>
@@ -2424,6 +2432,10 @@
               </w:rPr>
             </w:r>
             <w:r>
+              <w:rPr>
+                <w:sz w:val="18"/>
+                <w:szCs w:val="18"/>
+              </w:rPr>
               <w:t>{provider_signatory_title_display}</w:t>
             </w:r>
           </w:p>
@@ -2483,6 +2495,10 @@
               </w:rPr>
             </w:r>
             <w:r>
+              <w:rPr>
+                <w:sz w:val="18"/>
+                <w:szCs w:val="18"/>
+              </w:rPr>
               <w:t>{customer_signatory_title_display}</w:t>
             </w:r>
           </w:p>
@@ -2579,6 +2595,10 @@
               </w:rPr>
             </w:r>
             <w:r>
+              <w:rPr>
+                <w:sz w:val="18"/>
+                <w:szCs w:val="18"/>
+              </w:rPr>
               <w:t>{provider_signatory_email}</w:t>
             </w:r>
           </w:p>
@@ -2638,6 +2658,10 @@
               </w:rPr>
             </w:r>
             <w:r>
+              <w:rPr>
+                <w:sz w:val="18"/>
+                <w:szCs w:val="18"/>
+              </w:rPr>
               <w:t>{customer_signatory_email}</w:t>
             </w:r>
           </w:p>

</xml_diff>

<commit_message>
chore(templates): update contract templates and forms (#856)
Routine refresh of contract template and external-form artifacts and catalog metadata. Contributions are welcome — open an issue or pull request and we'll fold it in.

Co-authored-by: OpenAgreements <noreply@openagreements.org>
</commit_message>
<xml_diff>
--- a/templates/common-paper-cc-by-4.0/common-paper-ai-addendum/template.docx
+++ b/templates/common-paper-cc-by-4.0/common-paper-ai-addendum/template.docx
@@ -2295,6 +2295,10 @@
               </w:rPr>
             </w:r>
             <w:r>
+              <w:rPr>
+                <w:sz w:val="18"/>
+                <w:szCs w:val="18"/>
+              </w:rPr>
               <w:t>{provider_signatory_name}</w:t>
             </w:r>
           </w:p>
@@ -2354,6 +2358,10 @@
               </w:rPr>
             </w:r>
             <w:r>
+              <w:rPr>
+                <w:sz w:val="18"/>
+                <w:szCs w:val="18"/>
+              </w:rPr>
               <w:t>{customer_signatory_name}</w:t>
             </w:r>
           </w:p>
@@ -2424,6 +2432,10 @@
               </w:rPr>
             </w:r>
             <w:r>
+              <w:rPr>
+                <w:sz w:val="18"/>
+                <w:szCs w:val="18"/>
+              </w:rPr>
               <w:t>{provider_signatory_title_display}</w:t>
             </w:r>
           </w:p>
@@ -2483,6 +2495,10 @@
               </w:rPr>
             </w:r>
             <w:r>
+              <w:rPr>
+                <w:sz w:val="18"/>
+                <w:szCs w:val="18"/>
+              </w:rPr>
               <w:t>{customer_signatory_title_display}</w:t>
             </w:r>
           </w:p>
@@ -2579,6 +2595,10 @@
               </w:rPr>
             </w:r>
             <w:r>
+              <w:rPr>
+                <w:sz w:val="18"/>
+                <w:szCs w:val="18"/>
+              </w:rPr>
               <w:t>{provider_signatory_email}</w:t>
             </w:r>
           </w:p>
@@ -2638,6 +2658,10 @@
               </w:rPr>
             </w:r>
             <w:r>
+              <w:rPr>
+                <w:sz w:val="18"/>
+                <w:szCs w:val="18"/>
+              </w:rPr>
               <w:t>{customer_signatory_email}</w:t>
             </w:r>
           </w:p>

</xml_diff>